<commit_message>
Karta „Robota”: numery, dwie daty i rodzaj pracy z listy ustawowej
Pola karty według ustaleń: „Nr roboty” bez dopisku KERG i „Nr operatu” — oba
wymagane, „Data zgłoszenia pracy geodezyjnej” i „Data zakończenia pracy
geodezyjnej” z kalendarza, oraz „Rodzaj pracy” jako lista dziewięciu rodzajów
z formularza zgłoszenia pracy geodezyjnej. Położenie działki dostało własną
kartę — nie było na liście pól „Roboty”, a jest potrzebne.

`auto_numer` wypada z kontroli pól wymaganych: to pole ma zostać puste, bo numer
nadaje program przy generowaniu. Bez tego zaznaczenie „Nr operatu” jako wymaganego
blokowałoby generowanie na zawsze. Gwiazdka w formularzu zostaje — pole jest
obowiązkowe w dokumencie, tylko wypełnia je program, a nie człowiek.

Wzór szablonu przebudowany pod te pola, żeby brat miał gotowe nazwy tagów
do przeniesienia do własnej formatki.

Co-Authored-By: Claude Opus 5 <noreply@anthropic.com>
</commit_message>
<xml_diff>
--- a/szablony/operat_wzor.docx
+++ b/szablony/operat_wzor.docx
@@ -2,19 +2,6 @@
 <file path=word/document.xml><?xml version="1.0" encoding="utf-8"?>
 <w:document xmlns:wpc="http://schemas.microsoft.com/office/word/2010/wordprocessingCanvas" xmlns:mo="http://schemas.microsoft.com/office/mac/office/2008/main" xmlns:mc="http://schemas.openxmlformats.org/markup-compatibility/2006" xmlns:mv="urn:schemas-microsoft-com:mac:vml" xmlns:o="urn:schemas-microsoft-com:office:office" xmlns:r="http://schemas.openxmlformats.org/officeDocument/2006/relationships" xmlns:m="http://schemas.openxmlformats.org/officeDocument/2006/math" xmlns:v="urn:schemas-microsoft-com:vml" xmlns:wp14="http://schemas.microsoft.com/office/word/2010/wordprocessingDrawing" xmlns:wp="http://schemas.openxmlformats.org/drawingml/2006/wordprocessingDrawing" xmlns:w10="urn:schemas-microsoft-com:office:word" xmlns:w="http://schemas.openxmlformats.org/wordprocessingml/2006/main" xmlns:w14="http://schemas.microsoft.com/office/word/2010/wordml" xmlns:wpg="http://schemas.microsoft.com/office/word/2010/wordprocessingGroup" xmlns:wpi="http://schemas.microsoft.com/office/word/2010/wordprocessingInk" xmlns:wne="http://schemas.microsoft.com/office/word/2006/wordml" xmlns:wps="http://schemas.microsoft.com/office/word/2010/wordprocessingShape" mc:Ignorable="w14 wp14">
   <w:body>
-    <w:p>
-      <w:pPr>
-        <w:spacing w:before="120"/>
-        <w:jc w:val="right"/>
-      </w:pPr>
-      <w:r>
-        <w:rPr>
-          <w:b w:val="0"/>
-          <w:sz w:val="20"/>
-        </w:rPr>
-        <w:t>{{ data_dokumentu }}</w:t>
-      </w:r>
-    </w:p>
     <w:p>
       <w:pPr>
         <w:spacing w:before="960"/>
@@ -30,15 +17,15 @@
     </w:p>
     <w:p>
       <w:pPr>
-        <w:spacing w:before="160"/>
+        <w:spacing w:before="200"/>
         <w:jc w:val="center"/>
       </w:pPr>
       <w:r>
         <w:rPr>
           <w:b w:val="0"/>
-          <w:sz w:val="26"/>
+          <w:sz w:val="24"/>
         </w:rPr>
-        <w:t>{{ cel_opracowania }}</w:t>
+        <w:t>{{ rodzaj_pracy }}</w:t>
       </w:r>
     </w:p>
     <w:p>
@@ -51,7 +38,7 @@
           <w:b/>
           <w:sz w:val="24"/>
         </w:rPr>
-        <w:t>Nr roboty (KERG): {{ nr_roboty }}</w:t>
+        <w:t>Nr roboty: {{ nr_roboty }}</w:t>
       </w:r>
     </w:p>
     <w:p>
@@ -116,7 +103,7 @@
           <w:b w:val="0"/>
           <w:sz w:val="22"/>
         </w:rPr>
-        <w:t>Zgłoszono w: {{ osrodek }}</w:t>
+        <w:t>Zgłoszenie pracy geodezyjnej: {{ data_zgloszenia }}</w:t>
       </w:r>
     </w:p>
     <w:p>
@@ -129,7 +116,20 @@
           <w:b w:val="0"/>
           <w:sz w:val="22"/>
         </w:rPr>
-        <w:t>dnia {{ data_zgloszenia }}</w:t>
+        <w:t>Zakończenie pracy geodezyjnej: {{ data_zakonczenia }}</w:t>
+      </w:r>
+    </w:p>
+    <w:p>
+      <w:pPr>
+        <w:spacing w:before="0"/>
+        <w:jc w:val="center"/>
+      </w:pPr>
+      <w:r>
+        <w:rPr>
+          <w:b w:val="0"/>
+          <w:sz w:val="20"/>
+        </w:rPr>
+        <w:t>({{ data_zakonczenia_slownie }})</w:t>
       </w:r>
     </w:p>
     <w:p>

</xml_diff>

<commit_message>
Numer 001/2026, katalog 001.2026, pola I.Z.P.G i Nr działki
Numer operatu wraca do postaci z ukośnikiem — tak wygląda w dokumencie i tak
czyta go ośrodek. Nazwa katalogu bierze się z niego przez `nazwa_katalogu`,
która podmienia ukośnik na kropkę: Windows ukośnika w nazwie folderu nie
przyjmie, a kropka czyta się lepiej niż wcześniejszy myślnik.

Karta „Robota” ułożona po trzy i po dwa pola w rzędzie: nr roboty, nr operatu
i I.Z.P.G w pierwszym, obie daty w drugim, rodzaj pracy przez całą szerokość.
I.Z.P.G to nowe pole wymagane.

Pod położeniem działki doszło wymagane „Nr działki”.

Co-Authored-By: Claude Opus 5 <noreply@anthropic.com>
</commit_message>
<xml_diff>
--- a/szablony/operat_wzor.docx
+++ b/szablony/operat_wzor.docx
@@ -56,6 +56,19 @@
     </w:p>
     <w:p>
       <w:pPr>
+        <w:spacing w:before="0"/>
+        <w:jc w:val="center"/>
+      </w:pPr>
+      <w:r>
+        <w:rPr>
+          <w:b w:val="0"/>
+          <w:sz w:val="24"/>
+        </w:rPr>
+        <w:t>I.Z.P.G: {{ izpg }}</w:t>
+      </w:r>
+    </w:p>
+    <w:p>
+      <w:pPr>
         <w:spacing w:before="480"/>
         <w:jc w:val="center"/>
       </w:pPr>
@@ -91,6 +104,19 @@
           <w:sz w:val="24"/>
         </w:rPr>
         <w:t>Obręb: {{ polozenie_obreb_numer }} {{ polozenie_obreb }} ({{ polozenie_obreb_teryt }})</w:t>
+      </w:r>
+    </w:p>
+    <w:p>
+      <w:pPr>
+        <w:spacing w:before="0"/>
+        <w:jc w:val="center"/>
+      </w:pPr>
+      <w:r>
+        <w:rPr>
+          <w:b/>
+          <w:sz w:val="24"/>
+        </w:rPr>
+        <w:t>Działki nr: {{ nr_dzialki }}</w:t>
       </w:r>
     </w:p>
     <w:p>

</xml_diff>

<commit_message>
Karta „Spis treści”: lista wielokrotnego wyboru z pozycjami obowiązkowymi
Nowy typ pola `wybor_wielokrotny`: lista do odhaczenia, do dokumentu wchodzą
tylko zaznaczone pozycje. Pozycje wymienione w „zawsze” są w formularzu
zaznaczone i wyłączone — widać, że są w operacie, ale nie da się ich odznaczyć.

Kolejność bierze się z listy w .json, a nie z formularza: przeglądarka wysyła
zaznaczenia w kolejności klikania, a spis treści operatu ma stały porządek.
Pozycje obowiązkowe program dokłada sam, niezależnie od tego, co przyszło —
wyłączone pole i tak nie jest wysyłane.

W szablonie wypisuje się je pętlą `{%p for %}`, a `loop.index` numeruje od nowa,
więc pominięcie pozycji nie robi dziury w numeracji dokumentu.

Przy okazji: lista tekstów na stronie dokumentu pokazywała się jako „5 wierszy”.
Teraz widać treść; „N wierszy” zostaje dla tabel, gdzie ma sens.

Co-Authored-By: Claude Opus 5 <noreply@anthropic.com>
</commit_message>
<xml_diff>
--- a/szablony/operat_wzor.docx
+++ b/szablony/operat_wzor.docx
@@ -156,6 +156,55 @@
           <w:sz w:val="20"/>
         </w:rPr>
         <w:t>({{ data_zakonczenia_slownie }})</w:t>
+      </w:r>
+    </w:p>
+    <w:p>
+      <w:pPr>
+        <w:spacing w:before="960"/>
+        <w:jc w:val="center"/>
+      </w:pPr>
+      <w:r>
+        <w:rPr>
+          <w:b/>
+          <w:sz w:val="28"/>
+        </w:rPr>
+        <w:t>SPIS TREŚCI</w:t>
+      </w:r>
+    </w:p>
+    <w:p>
+      <w:pPr>
+        <w:spacing w:before="0"/>
+      </w:pPr>
+      <w:r>
+        <w:rPr>
+          <w:b w:val="0"/>
+          <w:sz w:val="22"/>
+        </w:rPr>
+        <w:t>{%p for pozycja in spis_tresci %}</w:t>
+      </w:r>
+    </w:p>
+    <w:p>
+      <w:pPr>
+        <w:spacing w:before="80"/>
+      </w:pPr>
+      <w:r>
+        <w:rPr>
+          <w:b w:val="0"/>
+          <w:sz w:val="24"/>
+        </w:rPr>
+        <w:t>{{ loop.index }}. {{ pozycja }}</w:t>
+      </w:r>
+    </w:p>
+    <w:p>
+      <w:pPr>
+        <w:spacing w:before="0"/>
+      </w:pPr>
+      <w:r>
+        <w:rPr>
+          <w:b w:val="0"/>
+          <w:sz w:val="22"/>
+        </w:rPr>
+        <w:t>{%p endfor %}</w:t>
       </w:r>
     </w:p>
     <w:p>

</xml_diff>